<commit_message>
update mainly on visualiztion
</commit_message>
<xml_diff>
--- a/week 4/Week4-report.docx
+++ b/week 4/Week4-report.docx
@@ -78,7 +78,7 @@
           <w:noProof/>
         </w:rPr>
         <w:drawing>
-          <wp:anchor distT="0" distB="0" distL="114300" distR="114300" simplePos="0" relativeHeight="251659264" behindDoc="1" locked="0" layoutInCell="1" allowOverlap="1" wp14:anchorId="09EB59F3" wp14:editId="126F20F9">
+          <wp:anchor distT="0" distB="0" distL="114300" distR="114300" simplePos="0" relativeHeight="251659264" behindDoc="1" locked="0" layoutInCell="1" allowOverlap="1" wp14:anchorId="09EB59F3" wp14:editId="25F24D42">
             <wp:simplePos x="0" y="0"/>
             <wp:positionH relativeFrom="margin">
               <wp:align>left</wp:align>
@@ -1199,21 +1199,7 @@
           <w:sz w:val="24"/>
           <w:szCs w:val="24"/>
         </w:rPr>
-        <w:t xml:space="preserve">P1 provided better initial results. In this context, "better" was defined as producing predictions with lower expected </w:t>
-      </w:r>
-      <w:r>
-        <w:rPr>
-          <w:sz w:val="24"/>
-          <w:szCs w:val="24"/>
-        </w:rPr>
-        <w:t>errors</w:t>
-      </w:r>
-      <w:r>
-        <w:rPr>
-          <w:sz w:val="24"/>
-          <w:szCs w:val="24"/>
-        </w:rPr>
-        <w:t>, reduced temporal lag, and closer visual alignment with actual stock price movements.</w:t>
+        <w:t>P1 provided better initial results. In this context, "better" was defined as producing predictions with lower expected errors, reduced temporal lag, and closer visual alignment with actual stock price movements.</w:t>
       </w:r>
     </w:p>
     <w:p>
@@ -8381,6 +8367,7 @@
   <w:style w:type="character" w:default="1" w:styleId="DefaultParagraphFont">
     <w:name w:val="Default Paragraph Font"/>
     <w:uiPriority w:val="1"/>
+    <w:semiHidden/>
     <w:unhideWhenUsed/>
   </w:style>
   <w:style w:type="table" w:default="1" w:styleId="TableNormal">

</xml_diff>